<commit_message>
Add Cascade comparison memo + Arrhenius temperature sensitivity variant
paper/cascade-comparison-memo.md compares Cascade's Weathering Potential
Explorer to our model. erw-9 gains a CLIMATE_TEMP_MODE toggle (linear default
| arrhenius, Ea=68.8 kJ/mol). paper/analysis/erw_arrhenius_variant.py builds a
per-pixel f_arr/f_lin multiplier for the erw-11/12 sweep (rmult); Arrhenius
raises SSA gross CDR ~27% capped and expands the illustrative public envelope
~+54%.
</commit_message>
<xml_diff>
--- a/paper/ERW modeling notes 260706.docx
+++ b/paper/ERW modeling notes 260706.docx
@@ -340,7 +340,7 @@
           <w:noProof/>
           <w:kern w:val="0"/>
         </w:rPr>
-        <w:pict w14:anchorId="367AD0A9">
+        <w:pict w14:anchorId="2EB7594C">
           <v:rect id="_x0000_i1029" alt="" style="width:468pt;height:.05pt;mso-width-percent:0;mso-height-percent:0;mso-width-percent:0;mso-height-percent:0" o:hralign="center" o:hrstd="t" o:hr="t" fillcolor="#a0a0a0" stroked="f"/>
         </w:pict>
       </w:r>
@@ -2925,109 +2925,175 @@
           <w:szCs w:val="21"/>
           <w14:ligatures w14:val="none"/>
         </w:rPr>
-        <w:t>A cost table like this belongs in the paper</w:t>
-      </w:r>
-      <w:r>
-        <w:rPr>
-          <w:rFonts w:ascii="Segoe UI" w:eastAsia="Times New Roman" w:hAnsi="Segoe UI" w:cs="Segoe UI"/>
-          <w:color w:val="839496"/>
-          <w:kern w:val="0"/>
-          <w:sz w:val="21"/>
-          <w:szCs w:val="21"/>
-          <w14:ligatures w14:val="none"/>
-        </w:rPr>
-        <w:t> (or SI) - it's the clearest way to preempt Q2-Q4 and it's currently only in prose/comments.</w:t>
+        <w:t>Weak spot.</w:t>
+      </w:r>
+      <w:r>
+        <w:rPr>
+          <w:rFonts w:ascii="Segoe UI" w:eastAsia="Times New Roman" w:hAnsi="Segoe UI" w:cs="Segoe UI"/>
+          <w:color w:val="839496"/>
+          <w:kern w:val="0"/>
+          <w:sz w:val="21"/>
+          <w:szCs w:val="21"/>
+          <w14:ligatures w14:val="none"/>
+        </w:rPr>
+        <w:t> Grinding-plant capex, quarry royalties, storage, and financing are </w:t>
+      </w:r>
+      <w:r>
+        <w:rPr>
+          <w:rFonts w:ascii="Segoe UI" w:eastAsia="Times New Roman" w:hAnsi="Segoe UI" w:cs="Segoe UI"/>
+          <w:i/>
+          <w:iCs/>
+          <w:color w:val="839496"/>
+          <w:kern w:val="0"/>
+          <w:sz w:val="21"/>
+          <w:szCs w:val="21"/>
+          <w14:ligatures w14:val="none"/>
+        </w:rPr>
+        <w:t>not</w:t>
+      </w:r>
+      <w:r>
+        <w:rPr>
+          <w:rFonts w:ascii="Segoe UI" w:eastAsia="Times New Roman" w:hAnsi="Segoe UI" w:cs="Segoe UI"/>
+          <w:color w:val="839496"/>
+          <w:kern w:val="0"/>
+          <w:sz w:val="21"/>
+          <w:szCs w:val="21"/>
+          <w14:ligatures w14:val="none"/>
+        </w:rPr>
+        <w:t> itemized - they are implicitly inside the $10 quarry gate and the energy-based grinding proxy. The $10/t is optimistic (assumes fines are a cheap by-product); worth a sensitivity row.</w:t>
       </w:r>
     </w:p>
     <w:p>
       <w:pPr>
-        <w:spacing w:after="240" w:line="240" w:lineRule="auto"/>
-        <w:rPr>
-          <w:rFonts w:ascii="Segoe UI" w:eastAsia="Times New Roman" w:hAnsi="Segoe UI" w:cs="Segoe UI"/>
-          <w:color w:val="839496"/>
-          <w:kern w:val="0"/>
-          <w:sz w:val="21"/>
-          <w:szCs w:val="21"/>
-          <w14:ligatures w14:val="none"/>
-        </w:rPr>
-      </w:pPr>
-      <w:r>
-        <w:rPr>
-          <w:rFonts w:ascii="Segoe UI" w:eastAsia="Times New Roman" w:hAnsi="Segoe UI" w:cs="Segoe UI"/>
-          <w:b/>
-          <w:bCs/>
-          <w:color w:val="839496"/>
-          <w:kern w:val="0"/>
-          <w:sz w:val="21"/>
-          <w:szCs w:val="21"/>
+        <w:spacing w:before="360" w:after="240" w:line="240" w:lineRule="auto"/>
+        <w:outlineLvl w:val="2"/>
+        <w:rPr>
+          <w:rFonts w:ascii="Segoe UI" w:eastAsia="Times New Roman" w:hAnsi="Segoe UI" w:cs="Segoe UI"/>
+          <w:b/>
+          <w:bCs/>
+          <w:color w:val="839496"/>
+          <w:kern w:val="0"/>
+          <w:sz w:val="30"/>
+          <w:szCs w:val="30"/>
+          <w14:ligatures w14:val="none"/>
+        </w:rPr>
+      </w:pPr>
+      <w:r>
+        <w:rPr>
+          <w:rFonts w:ascii="Segoe UI" w:eastAsia="Times New Roman" w:hAnsi="Segoe UI" w:cs="Segoe UI"/>
+          <w:b/>
+          <w:bCs/>
+          <w:color w:val="839496"/>
+          <w:kern w:val="0"/>
+          <w:sz w:val="30"/>
+          <w:szCs w:val="30"/>
           <w14:ligatures w14:val="none"/>
         </w:rPr>
         <w:lastRenderedPageBreak/>
-        <w:t>Weak spot.</w:t>
-      </w:r>
-      <w:r>
-        <w:rPr>
-          <w:rFonts w:ascii="Segoe UI" w:eastAsia="Times New Roman" w:hAnsi="Segoe UI" w:cs="Segoe UI"/>
-          <w:color w:val="839496"/>
-          <w:kern w:val="0"/>
-          <w:sz w:val="21"/>
-          <w:szCs w:val="21"/>
-          <w14:ligatures w14:val="none"/>
-        </w:rPr>
-        <w:t> Grinding-plant capex, quarry royalties, storage, and financing are </w:t>
-      </w:r>
-      <w:r>
-        <w:rPr>
-          <w:rFonts w:ascii="Segoe UI" w:eastAsia="Times New Roman" w:hAnsi="Segoe UI" w:cs="Segoe UI"/>
-          <w:i/>
-          <w:iCs/>
-          <w:color w:val="839496"/>
-          <w:kern w:val="0"/>
-          <w:sz w:val="21"/>
-          <w:szCs w:val="21"/>
-          <w14:ligatures w14:val="none"/>
-        </w:rPr>
-        <w:t>not</w:t>
-      </w:r>
-      <w:r>
-        <w:rPr>
-          <w:rFonts w:ascii="Segoe UI" w:eastAsia="Times New Roman" w:hAnsi="Segoe UI" w:cs="Segoe UI"/>
-          <w:color w:val="839496"/>
-          <w:kern w:val="0"/>
-          <w:sz w:val="21"/>
-          <w:szCs w:val="21"/>
-          <w14:ligatures w14:val="none"/>
-        </w:rPr>
-        <w:t> itemized - they are implicitly inside the $10 quarry gate and the energy-based grinding proxy. The $10/t is optimistic (assumes fines are a cheap by-product); worth a sensitivity row.</w:t>
+        <w:t>4. The MRV assumption, explicitly</w:t>
       </w:r>
     </w:p>
     <w:p>
       <w:pPr>
-        <w:spacing w:before="360" w:after="240" w:line="240" w:lineRule="auto"/>
-        <w:outlineLvl w:val="2"/>
-        <w:rPr>
-          <w:rFonts w:ascii="Segoe UI" w:eastAsia="Times New Roman" w:hAnsi="Segoe UI" w:cs="Segoe UI"/>
-          <w:b/>
-          <w:bCs/>
-          <w:color w:val="839496"/>
-          <w:kern w:val="0"/>
-          <w:sz w:val="30"/>
-          <w:szCs w:val="30"/>
-          <w14:ligatures w14:val="none"/>
-        </w:rPr>
-      </w:pPr>
-      <w:r>
-        <w:rPr>
-          <w:rFonts w:ascii="Segoe UI" w:eastAsia="Times New Roman" w:hAnsi="Segoe UI" w:cs="Segoe UI"/>
-          <w:b/>
-          <w:bCs/>
-          <w:color w:val="839496"/>
-          <w:kern w:val="0"/>
-          <w:sz w:val="30"/>
-          <w:szCs w:val="30"/>
-          <w14:ligatures w14:val="none"/>
-        </w:rPr>
-        <w:t>4. The MRV assumption, explicitly</w:t>
+        <w:spacing w:after="240" w:line="240" w:lineRule="auto"/>
+        <w:rPr>
+          <w:rFonts w:ascii="Segoe UI" w:eastAsia="Times New Roman" w:hAnsi="Segoe UI" w:cs="Segoe UI"/>
+          <w:color w:val="839496"/>
+          <w:kern w:val="0"/>
+          <w:sz w:val="21"/>
+          <w:szCs w:val="21"/>
+          <w14:ligatures w14:val="none"/>
+        </w:rPr>
+      </w:pPr>
+      <w:r>
+        <w:rPr>
+          <w:rFonts w:ascii="Segoe UI" w:eastAsia="Times New Roman" w:hAnsi="Segoe UI" w:cs="Segoe UI"/>
+          <w:b/>
+          <w:bCs/>
+          <w:color w:val="839496"/>
+          <w:kern w:val="0"/>
+          <w:sz w:val="21"/>
+          <w:szCs w:val="21"/>
+          <w14:ligatures w14:val="none"/>
+        </w:rPr>
+        <w:t>MRV = $20 per tCO₂</w:t>
+      </w:r>
+      <w:r>
+        <w:rPr>
+          <w:rFonts w:ascii="Segoe UI" w:eastAsia="Times New Roman" w:hAnsi="Segoe UI" w:cs="Segoe UI"/>
+          <w:color w:val="839496"/>
+          <w:kern w:val="0"/>
+          <w:sz w:val="21"/>
+          <w:szCs w:val="21"/>
+          <w14:ligatures w14:val="none"/>
+        </w:rPr>
+        <w:t>, subtracted directly from the carbon price so revenue = </w:t>
+      </w:r>
+      <w:r>
+        <w:rPr>
+          <w:rFonts w:ascii="Menlo" w:eastAsia="Times New Roman" w:hAnsi="Menlo" w:cs="Menlo"/>
+          <w:color w:val="D7BA7D"/>
+          <w:kern w:val="0"/>
+          <w:sz w:val="21"/>
+          <w:szCs w:val="21"/>
+          <w14:ligatures w14:val="none"/>
+        </w:rPr>
+        <w:t>net_CDR × (carbon_price − MRV) = net_CDR × ($150 − $20)</w:t>
+      </w:r>
+      <w:r>
+        <w:rPr>
+          <w:rFonts w:ascii="Segoe UI" w:eastAsia="Times New Roman" w:hAnsi="Segoe UI" w:cs="Segoe UI"/>
+          <w:color w:val="839496"/>
+          <w:kern w:val="0"/>
+          <w:sz w:val="21"/>
+          <w:szCs w:val="21"/>
+          <w14:ligatures w14:val="none"/>
+        </w:rPr>
+        <w:t>. </w:t>
+      </w:r>
+      <w:r>
+        <w:rPr>
+          <w:rFonts w:ascii="Menlo" w:eastAsia="Times New Roman" w:hAnsi="Menlo" w:cs="Menlo"/>
+          <w:color w:val="D7BA7D"/>
+          <w:kern w:val="0"/>
+          <w:sz w:val="21"/>
+          <w:szCs w:val="21"/>
+          <w14:ligatures w14:val="none"/>
+        </w:rPr>
+        <w:t>MRV_COST_USD_T_CO2</w:t>
+      </w:r>
+      <w:r>
+        <w:rPr>
+          <w:rFonts w:ascii="Segoe UI" w:eastAsia="Times New Roman" w:hAnsi="Segoe UI" w:cs="Segoe UI"/>
+          <w:color w:val="839496"/>
+          <w:kern w:val="0"/>
+          <w:sz w:val="21"/>
+          <w:szCs w:val="21"/>
+          <w14:ligatures w14:val="none"/>
+        </w:rPr>
+        <w:t> in </w:t>
+      </w:r>
+      <w:r>
+        <w:rPr>
+          <w:rFonts w:ascii="Menlo" w:eastAsia="Times New Roman" w:hAnsi="Menlo" w:cs="Menlo"/>
+          <w:color w:val="D7BA7D"/>
+          <w:kern w:val="0"/>
+          <w:sz w:val="21"/>
+          <w:szCs w:val="21"/>
+          <w14:ligatures w14:val="none"/>
+        </w:rPr>
+        <w:t>erw-7</w:t>
+      </w:r>
+      <w:r>
+        <w:rPr>
+          <w:rFonts w:ascii="Segoe UI" w:eastAsia="Times New Roman" w:hAnsi="Segoe UI" w:cs="Segoe UI"/>
+          <w:color w:val="839496"/>
+          <w:kern w:val="0"/>
+          <w:sz w:val="21"/>
+          <w:szCs w:val="21"/>
+          <w14:ligatures w14:val="none"/>
+        </w:rPr>
+        <w:t>.</w:t>
       </w:r>
     </w:p>
     <w:p>
@@ -3045,92 +3111,61 @@
       <w:r>
         <w:rPr>
           <w:rFonts w:ascii="Segoe UI" w:eastAsia="Times New Roman" w:hAnsi="Segoe UI" w:cs="Segoe UI"/>
-          <w:b/>
-          <w:bCs/>
-          <w:color w:val="839496"/>
-          <w:kern w:val="0"/>
-          <w:sz w:val="21"/>
-          <w:szCs w:val="21"/>
-          <w14:ligatures w14:val="none"/>
-        </w:rPr>
-        <w:t>MRV = $20 per tCO₂</w:t>
-      </w:r>
-      <w:r>
-        <w:rPr>
-          <w:rFonts w:ascii="Segoe UI" w:eastAsia="Times New Roman" w:hAnsi="Segoe UI" w:cs="Segoe UI"/>
-          <w:color w:val="839496"/>
-          <w:kern w:val="0"/>
-          <w:sz w:val="21"/>
-          <w:szCs w:val="21"/>
-          <w14:ligatures w14:val="none"/>
-        </w:rPr>
-        <w:t>, subtracted directly from the carbon price so revenue = </w:t>
-      </w:r>
-      <w:r>
-        <w:rPr>
-          <w:rFonts w:ascii="Menlo" w:eastAsia="Times New Roman" w:hAnsi="Menlo" w:cs="Menlo"/>
-          <w:color w:val="D7BA7D"/>
-          <w:kern w:val="0"/>
-          <w:sz w:val="21"/>
-          <w:szCs w:val="21"/>
-          <w14:ligatures w14:val="none"/>
-        </w:rPr>
-        <w:t>net_CDR × (carbon_price − MRV) = net_CDR × ($150 − $20)</w:t>
-      </w:r>
-      <w:r>
-        <w:rPr>
-          <w:rFonts w:ascii="Segoe UI" w:eastAsia="Times New Roman" w:hAnsi="Segoe UI" w:cs="Segoe UI"/>
-          <w:color w:val="839496"/>
-          <w:kern w:val="0"/>
-          <w:sz w:val="21"/>
-          <w:szCs w:val="21"/>
-          <w14:ligatures w14:val="none"/>
-        </w:rPr>
-        <w:t>. </w:t>
-      </w:r>
-      <w:r>
-        <w:rPr>
-          <w:rFonts w:ascii="Menlo" w:eastAsia="Times New Roman" w:hAnsi="Menlo" w:cs="Menlo"/>
-          <w:color w:val="D7BA7D"/>
-          <w:kern w:val="0"/>
-          <w:sz w:val="21"/>
-          <w:szCs w:val="21"/>
-          <w14:ligatures w14:val="none"/>
-        </w:rPr>
-        <w:t>MRV_COST_USD_T_CO2</w:t>
-      </w:r>
-      <w:r>
-        <w:rPr>
-          <w:rFonts w:ascii="Segoe UI" w:eastAsia="Times New Roman" w:hAnsi="Segoe UI" w:cs="Segoe UI"/>
-          <w:color w:val="839496"/>
-          <w:kern w:val="0"/>
-          <w:sz w:val="21"/>
-          <w:szCs w:val="21"/>
-          <w14:ligatures w14:val="none"/>
-        </w:rPr>
-        <w:t> in </w:t>
-      </w:r>
-      <w:r>
-        <w:rPr>
-          <w:rFonts w:ascii="Menlo" w:eastAsia="Times New Roman" w:hAnsi="Menlo" w:cs="Menlo"/>
-          <w:color w:val="D7BA7D"/>
-          <w:kern w:val="0"/>
-          <w:sz w:val="21"/>
-          <w:szCs w:val="21"/>
-          <w14:ligatures w14:val="none"/>
-        </w:rPr>
-        <w:t>erw-7</w:t>
-      </w:r>
-      <w:r>
-        <w:rPr>
-          <w:rFonts w:ascii="Segoe UI" w:eastAsia="Times New Roman" w:hAnsi="Segoe UI" w:cs="Segoe UI"/>
-          <w:color w:val="839496"/>
-          <w:kern w:val="0"/>
-          <w:sz w:val="21"/>
-          <w:szCs w:val="21"/>
-          <w14:ligatures w14:val="none"/>
-        </w:rPr>
-        <w:t>.</w:t>
+          <w:color w:val="839496"/>
+          <w:kern w:val="0"/>
+          <w:sz w:val="21"/>
+          <w:szCs w:val="21"/>
+          <w14:ligatures w14:val="none"/>
+        </w:rPr>
+        <w:t>The stack it represents: field sampling, lab analysis, verification, and registry fees. Code comment records the reasoning: </w:t>
+      </w:r>
+      <w:r>
+        <w:rPr>
+          <w:rFonts w:ascii="Segoe UI" w:eastAsia="Times New Roman" w:hAnsi="Segoe UI" w:cs="Segoe UI"/>
+          <w:b/>
+          <w:bCs/>
+          <w:color w:val="839496"/>
+          <w:kern w:val="0"/>
+          <w:sz w:val="21"/>
+          <w:szCs w:val="21"/>
+          <w14:ligatures w14:val="none"/>
+        </w:rPr>
+        <w:t>$30/tCO₂</w:t>
+      </w:r>
+      <w:r>
+        <w:rPr>
+          <w:rFonts w:ascii="Segoe UI" w:eastAsia="Times New Roman" w:hAnsi="Segoe UI" w:cs="Segoe UI"/>
+          <w:color w:val="839496"/>
+          <w:kern w:val="0"/>
+          <w:sz w:val="21"/>
+          <w:szCs w:val="21"/>
+          <w14:ligatures w14:val="none"/>
+        </w:rPr>
+        <w:t> is the first-of-kind pilot benchmark (Levy et al. 2024); </w:t>
+      </w:r>
+      <w:r>
+        <w:rPr>
+          <w:rFonts w:ascii="Segoe UI" w:eastAsia="Times New Roman" w:hAnsi="Segoe UI" w:cs="Segoe UI"/>
+          <w:b/>
+          <w:bCs/>
+          <w:color w:val="839496"/>
+          <w:kern w:val="0"/>
+          <w:sz w:val="21"/>
+          <w:szCs w:val="21"/>
+          <w14:ligatures w14:val="none"/>
+        </w:rPr>
+        <w:t>$20</w:t>
+      </w:r>
+      <w:r>
+        <w:rPr>
+          <w:rFonts w:ascii="Segoe UI" w:eastAsia="Times New Roman" w:hAnsi="Segoe UI" w:cs="Segoe UI"/>
+          <w:color w:val="839496"/>
+          <w:kern w:val="0"/>
+          <w:sz w:val="21"/>
+          <w:szCs w:val="21"/>
+          <w14:ligatures w14:val="none"/>
+        </w:rPr>
+        <w:t> is the at-scale aggregator/pooling target (Isometric/Puro-type protocols, 2027+). We use the optimistic-but-defensible $20 in the headline.</w:t>
       </w:r>
     </w:p>
     <w:p>
@@ -3148,126 +3183,54 @@
       <w:r>
         <w:rPr>
           <w:rFonts w:ascii="Segoe UI" w:eastAsia="Times New Roman" w:hAnsi="Segoe UI" w:cs="Segoe UI"/>
-          <w:color w:val="839496"/>
-          <w:kern w:val="0"/>
-          <w:sz w:val="21"/>
-          <w:szCs w:val="21"/>
-          <w14:ligatures w14:val="none"/>
-        </w:rPr>
-        <w:t>The stack it represents: field sampling, lab analysis, verification, and registry fees. Code comment records the reasoning: </w:t>
-      </w:r>
-      <w:r>
-        <w:rPr>
-          <w:rFonts w:ascii="Segoe UI" w:eastAsia="Times New Roman" w:hAnsi="Segoe UI" w:cs="Segoe UI"/>
-          <w:b/>
-          <w:bCs/>
-          <w:color w:val="839496"/>
-          <w:kern w:val="0"/>
-          <w:sz w:val="21"/>
-          <w:szCs w:val="21"/>
-          <w14:ligatures w14:val="none"/>
-        </w:rPr>
-        <w:t>$30/tCO₂</w:t>
-      </w:r>
-      <w:r>
-        <w:rPr>
-          <w:rFonts w:ascii="Segoe UI" w:eastAsia="Times New Roman" w:hAnsi="Segoe UI" w:cs="Segoe UI"/>
-          <w:color w:val="839496"/>
-          <w:kern w:val="0"/>
-          <w:sz w:val="21"/>
-          <w:szCs w:val="21"/>
-          <w14:ligatures w14:val="none"/>
-        </w:rPr>
-        <w:t> is the first-of-kind pilot benchmark (Levy et al. 2024); </w:t>
-      </w:r>
-      <w:r>
-        <w:rPr>
-          <w:rFonts w:ascii="Segoe UI" w:eastAsia="Times New Roman" w:hAnsi="Segoe UI" w:cs="Segoe UI"/>
-          <w:b/>
-          <w:bCs/>
-          <w:color w:val="839496"/>
-          <w:kern w:val="0"/>
-          <w:sz w:val="21"/>
-          <w:szCs w:val="21"/>
-          <w14:ligatures w14:val="none"/>
-        </w:rPr>
-        <w:t>$20</w:t>
-      </w:r>
-      <w:r>
-        <w:rPr>
-          <w:rFonts w:ascii="Segoe UI" w:eastAsia="Times New Roman" w:hAnsi="Segoe UI" w:cs="Segoe UI"/>
-          <w:color w:val="839496"/>
-          <w:kern w:val="0"/>
-          <w:sz w:val="21"/>
-          <w:szCs w:val="21"/>
-          <w14:ligatures w14:val="none"/>
-        </w:rPr>
-        <w:t> is the at-scale aggregator/pooling target (Isometric/Puro-type protocols, 2027+). We use the optimistic-but-defensible $20 in the headline.</w:t>
+          <w:b/>
+          <w:bCs/>
+          <w:color w:val="839496"/>
+          <w:kern w:val="0"/>
+          <w:sz w:val="21"/>
+          <w:szCs w:val="21"/>
+          <w14:ligatures w14:val="none"/>
+        </w:rPr>
+        <w:t>Weak spot / response.</w:t>
+      </w:r>
+      <w:r>
+        <w:rPr>
+          <w:rFonts w:ascii="Segoe UI" w:eastAsia="Times New Roman" w:hAnsi="Segoe UI" w:cs="Segoe UI"/>
+          <w:color w:val="839496"/>
+          <w:kern w:val="0"/>
+          <w:sz w:val="21"/>
+          <w:szCs w:val="21"/>
+          <w14:ligatures w14:val="none"/>
+        </w:rPr>
+        <w:t> Real early-market ERW MRV (dense soil/water sampling, uncertain reactive-transport models) can run </w:t>
+      </w:r>
+      <w:r>
+        <w:rPr>
+          <w:rFonts w:ascii="Segoe UI" w:eastAsia="Times New Roman" w:hAnsi="Segoe UI" w:cs="Segoe UI"/>
+          <w:b/>
+          <w:bCs/>
+          <w:color w:val="839496"/>
+          <w:kern w:val="0"/>
+          <w:sz w:val="21"/>
+          <w:szCs w:val="21"/>
+          <w14:ligatures w14:val="none"/>
+        </w:rPr>
+        <w:t>far above $20</w:t>
+      </w:r>
+      <w:r>
+        <w:rPr>
+          <w:rFonts w:ascii="Segoe UI" w:eastAsia="Times New Roman" w:hAnsi="Segoe UI" w:cs="Segoe UI"/>
+          <w:color w:val="839496"/>
+          <w:kern w:val="0"/>
+          <w:sz w:val="21"/>
+          <w:szCs w:val="21"/>
+          <w14:ligatures w14:val="none"/>
+        </w:rPr>
+        <w:t> - some estimates put first-mover MRV at $50-100+/tCO₂. Since MRV enters one-for-one with price, it's a first-order lever. Response: hold it explicit, sweep $20/$30/$50, and note the headline uses the mature-market value.</w:t>
       </w:r>
     </w:p>
     <w:p>
       <w:pPr>
-        <w:spacing w:after="240" w:line="240" w:lineRule="auto"/>
-        <w:rPr>
-          <w:rFonts w:ascii="Segoe UI" w:eastAsia="Times New Roman" w:hAnsi="Segoe UI" w:cs="Segoe UI"/>
-          <w:color w:val="839496"/>
-          <w:kern w:val="0"/>
-          <w:sz w:val="21"/>
-          <w:szCs w:val="21"/>
-          <w14:ligatures w14:val="none"/>
-        </w:rPr>
-      </w:pPr>
-      <w:r>
-        <w:rPr>
-          <w:rFonts w:ascii="Segoe UI" w:eastAsia="Times New Roman" w:hAnsi="Segoe UI" w:cs="Segoe UI"/>
-          <w:b/>
-          <w:bCs/>
-          <w:color w:val="839496"/>
-          <w:kern w:val="0"/>
-          <w:sz w:val="21"/>
-          <w:szCs w:val="21"/>
-          <w14:ligatures w14:val="none"/>
-        </w:rPr>
-        <w:t>Weak spot / response.</w:t>
-      </w:r>
-      <w:r>
-        <w:rPr>
-          <w:rFonts w:ascii="Segoe UI" w:eastAsia="Times New Roman" w:hAnsi="Segoe UI" w:cs="Segoe UI"/>
-          <w:color w:val="839496"/>
-          <w:kern w:val="0"/>
-          <w:sz w:val="21"/>
-          <w:szCs w:val="21"/>
-          <w14:ligatures w14:val="none"/>
-        </w:rPr>
-        <w:t> Real early-market ERW MRV (dense soil/water sampling, uncertain reactive-transport models) can run </w:t>
-      </w:r>
-      <w:r>
-        <w:rPr>
-          <w:rFonts w:ascii="Segoe UI" w:eastAsia="Times New Roman" w:hAnsi="Segoe UI" w:cs="Segoe UI"/>
-          <w:b/>
-          <w:bCs/>
-          <w:color w:val="839496"/>
-          <w:kern w:val="0"/>
-          <w:sz w:val="21"/>
-          <w:szCs w:val="21"/>
-          <w14:ligatures w14:val="none"/>
-        </w:rPr>
-        <w:t>far above $20</w:t>
-      </w:r>
-      <w:r>
-        <w:rPr>
-          <w:rFonts w:ascii="Segoe UI" w:eastAsia="Times New Roman" w:hAnsi="Segoe UI" w:cs="Segoe UI"/>
-          <w:color w:val="839496"/>
-          <w:kern w:val="0"/>
-          <w:sz w:val="21"/>
-          <w:szCs w:val="21"/>
-          <w14:ligatures w14:val="none"/>
-        </w:rPr>
-        <w:t> - some estimates put first-mover MRV at $50-100+/tCO₂. Since MRV enters one-for-one with price, it's a first-order lever. Response: hold it explicit, sweep $20/$30/$50, and note the headline uses the mature-market value.</w:t>
-      </w:r>
-    </w:p>
-    <w:p>
-      <w:pPr>
         <w:spacing w:after="0" w:line="240" w:lineRule="auto"/>
         <w:rPr>
           <w:rFonts w:ascii="Segoe UI" w:eastAsia="Times New Roman" w:hAnsi="Segoe UI" w:cs="Segoe UI"/>
@@ -3283,7 +3246,7 @@
           <w:noProof/>
           <w:kern w:val="0"/>
         </w:rPr>
-        <w:pict w14:anchorId="6F3AF7E6">
+        <w:pict w14:anchorId="6A9A47E2">
           <v:rect id="_x0000_i1028" style="width:0;height:.75pt" o:hralign="center" o:hrstd="t" o:hr="t" fillcolor="#a0a0a0" stroked="f"/>
         </w:pict>
       </w:r>
@@ -3674,7 +3637,6 @@
           <w:szCs w:val="30"/>
           <w14:ligatures w14:val="none"/>
         </w:rPr>
-        <w:lastRenderedPageBreak/>
         <w:t>6. Slide 8 - units of "Durable CDR (Mt)" and "% treated"</w:t>
       </w:r>
     </w:p>
@@ -3705,6 +3667,7 @@
           <w:szCs w:val="21"/>
           <w14:ligatures w14:val="none"/>
         </w:rPr>
+        <w:lastRenderedPageBreak/>
         <w:t>Durable CDR (Mt)</w:t>
       </w:r>
       <w:r>
@@ -3858,7 +3821,33 @@
           <w:szCs w:val="30"/>
           <w14:ligatures w14:val="none"/>
         </w:rPr>
-        <w:t>7. Slide 9 - reference for </w:t>
+        <w:t xml:space="preserve">7. Slide </w:t>
+      </w:r>
+      <w:r>
+        <w:rPr>
+          <w:rFonts w:ascii="Segoe UI" w:eastAsia="Times New Roman" w:hAnsi="Segoe UI" w:cs="Segoe UI"/>
+          <w:b/>
+          <w:bCs/>
+          <w:color w:val="839496"/>
+          <w:kern w:val="0"/>
+          <w:sz w:val="30"/>
+          <w:szCs w:val="30"/>
+          <w14:ligatures w14:val="none"/>
+        </w:rPr>
+        <w:t>10</w:t>
+      </w:r>
+      <w:r>
+        <w:rPr>
+          <w:rFonts w:ascii="Segoe UI" w:eastAsia="Times New Roman" w:hAnsi="Segoe UI" w:cs="Segoe UI"/>
+          <w:b/>
+          <w:bCs/>
+          <w:color w:val="839496"/>
+          <w:kern w:val="0"/>
+          <w:sz w:val="30"/>
+          <w:szCs w:val="30"/>
+          <w14:ligatures w14:val="none"/>
+        </w:rPr>
+        <w:t xml:space="preserve"> - reference for </w:t>
       </w:r>
       <w:r>
         <w:rPr>
@@ -4713,8 +4702,7 @@
           <w:noProof/>
           <w:kern w:val="0"/>
         </w:rPr>
-        <w:lastRenderedPageBreak/>
-        <w:pict w14:anchorId="426EDB25">
+        <w:pict w14:anchorId="536B3D79">
           <v:rect id="_x0000_i1027" style="width:0;height:.75pt" o:hralign="center" o:hrstd="t" o:hr="t" fillcolor="#a0a0a0" stroked="f"/>
         </w:pict>
       </w:r>
@@ -4745,6 +4733,7 @@
           <w:szCs w:val="36"/>
           <w14:ligatures w14:val="none"/>
         </w:rPr>
+        <w:lastRenderedPageBreak/>
         <w:t>C. Agronomic response (slide 10) and kinetics (slides 10-11)</w:t>
       </w:r>
     </w:p>
@@ -5529,6 +5518,7 @@
           <w14:ligatures w14:val="none"/>
         </w:rPr>
       </w:pPr>
+      <w:bookmarkStart w:id="0" w:name="OLE_LINK1"/>
       <w:r>
         <w:rPr>
           <w:rFonts w:ascii="Menlo" w:eastAsia="Times New Roman" w:hAnsi="Menlo" w:cs="Menlo"/>
@@ -5598,6 +5588,7 @@
         <w:t> is the (uncertain) proportionality between ECEC and buffering.</w:t>
       </w:r>
     </w:p>
+    <w:bookmarkEnd w:id="0"/>
     <w:p>
       <w:pPr>
         <w:numPr>
@@ -6627,7 +6618,7 @@
           <w:noProof/>
           <w:kern w:val="0"/>
         </w:rPr>
-        <w:pict w14:anchorId="3A4E17F2">
+        <w:pict w14:anchorId="1DD90BCF">
           <v:rect id="_x0000_i1026" alt="" style="width:468pt;height:.05pt;mso-width-percent:0;mso-height-percent:0;mso-width-percent:0;mso-height-percent:0" o:hralign="center" o:hrstd="t" o:hr="t" fillcolor="#a0a0a0" stroked="f"/>
         </w:pict>
       </w:r>
@@ -7215,7 +7206,7 @@
           <w:noProof/>
           <w:kern w:val="0"/>
         </w:rPr>
-        <w:pict w14:anchorId="48FED932">
+        <w:pict w14:anchorId="78D70E67">
           <v:rect id="_x0000_i1025" style="width:0;height:.75pt" o:hralign="center" o:hrstd="t" o:hr="t" fillcolor="#a0a0a0" stroked="f"/>
         </w:pict>
       </w:r>

</xml_diff>

<commit_message>
Adding alternative weathering assumptions as sensitivity
git commit -m "Adding sensitivity to alt weathering assumptions"
</commit_message>
<xml_diff>
--- a/paper/ERW modeling notes 260706.docx
+++ b/paper/ERW modeling notes 260706.docx
@@ -340,7 +340,7 @@
           <w:noProof/>
           <w:kern w:val="0"/>
         </w:rPr>
-        <w:pict w14:anchorId="367AD0A9">
+        <w:pict w14:anchorId="2EB7594C">
           <v:rect id="_x0000_i1029" alt="" style="width:468pt;height:.05pt;mso-width-percent:0;mso-height-percent:0;mso-width-percent:0;mso-height-percent:0" o:hralign="center" o:hrstd="t" o:hr="t" fillcolor="#a0a0a0" stroked="f"/>
         </w:pict>
       </w:r>
@@ -2925,109 +2925,175 @@
           <w:szCs w:val="21"/>
           <w14:ligatures w14:val="none"/>
         </w:rPr>
-        <w:t>A cost table like this belongs in the paper</w:t>
-      </w:r>
-      <w:r>
-        <w:rPr>
-          <w:rFonts w:ascii="Segoe UI" w:eastAsia="Times New Roman" w:hAnsi="Segoe UI" w:cs="Segoe UI"/>
-          <w:color w:val="839496"/>
-          <w:kern w:val="0"/>
-          <w:sz w:val="21"/>
-          <w:szCs w:val="21"/>
-          <w14:ligatures w14:val="none"/>
-        </w:rPr>
-        <w:t> (or SI) - it's the clearest way to preempt Q2-Q4 and it's currently only in prose/comments.</w:t>
+        <w:t>Weak spot.</w:t>
+      </w:r>
+      <w:r>
+        <w:rPr>
+          <w:rFonts w:ascii="Segoe UI" w:eastAsia="Times New Roman" w:hAnsi="Segoe UI" w:cs="Segoe UI"/>
+          <w:color w:val="839496"/>
+          <w:kern w:val="0"/>
+          <w:sz w:val="21"/>
+          <w:szCs w:val="21"/>
+          <w14:ligatures w14:val="none"/>
+        </w:rPr>
+        <w:t> Grinding-plant capex, quarry royalties, storage, and financing are </w:t>
+      </w:r>
+      <w:r>
+        <w:rPr>
+          <w:rFonts w:ascii="Segoe UI" w:eastAsia="Times New Roman" w:hAnsi="Segoe UI" w:cs="Segoe UI"/>
+          <w:i/>
+          <w:iCs/>
+          <w:color w:val="839496"/>
+          <w:kern w:val="0"/>
+          <w:sz w:val="21"/>
+          <w:szCs w:val="21"/>
+          <w14:ligatures w14:val="none"/>
+        </w:rPr>
+        <w:t>not</w:t>
+      </w:r>
+      <w:r>
+        <w:rPr>
+          <w:rFonts w:ascii="Segoe UI" w:eastAsia="Times New Roman" w:hAnsi="Segoe UI" w:cs="Segoe UI"/>
+          <w:color w:val="839496"/>
+          <w:kern w:val="0"/>
+          <w:sz w:val="21"/>
+          <w:szCs w:val="21"/>
+          <w14:ligatures w14:val="none"/>
+        </w:rPr>
+        <w:t> itemized - they are implicitly inside the $10 quarry gate and the energy-based grinding proxy. The $10/t is optimistic (assumes fines are a cheap by-product); worth a sensitivity row.</w:t>
       </w:r>
     </w:p>
     <w:p>
       <w:pPr>
-        <w:spacing w:after="240" w:line="240" w:lineRule="auto"/>
-        <w:rPr>
-          <w:rFonts w:ascii="Segoe UI" w:eastAsia="Times New Roman" w:hAnsi="Segoe UI" w:cs="Segoe UI"/>
-          <w:color w:val="839496"/>
-          <w:kern w:val="0"/>
-          <w:sz w:val="21"/>
-          <w:szCs w:val="21"/>
-          <w14:ligatures w14:val="none"/>
-        </w:rPr>
-      </w:pPr>
-      <w:r>
-        <w:rPr>
-          <w:rFonts w:ascii="Segoe UI" w:eastAsia="Times New Roman" w:hAnsi="Segoe UI" w:cs="Segoe UI"/>
-          <w:b/>
-          <w:bCs/>
-          <w:color w:val="839496"/>
-          <w:kern w:val="0"/>
-          <w:sz w:val="21"/>
-          <w:szCs w:val="21"/>
+        <w:spacing w:before="360" w:after="240" w:line="240" w:lineRule="auto"/>
+        <w:outlineLvl w:val="2"/>
+        <w:rPr>
+          <w:rFonts w:ascii="Segoe UI" w:eastAsia="Times New Roman" w:hAnsi="Segoe UI" w:cs="Segoe UI"/>
+          <w:b/>
+          <w:bCs/>
+          <w:color w:val="839496"/>
+          <w:kern w:val="0"/>
+          <w:sz w:val="30"/>
+          <w:szCs w:val="30"/>
+          <w14:ligatures w14:val="none"/>
+        </w:rPr>
+      </w:pPr>
+      <w:r>
+        <w:rPr>
+          <w:rFonts w:ascii="Segoe UI" w:eastAsia="Times New Roman" w:hAnsi="Segoe UI" w:cs="Segoe UI"/>
+          <w:b/>
+          <w:bCs/>
+          <w:color w:val="839496"/>
+          <w:kern w:val="0"/>
+          <w:sz w:val="30"/>
+          <w:szCs w:val="30"/>
           <w14:ligatures w14:val="none"/>
         </w:rPr>
         <w:lastRenderedPageBreak/>
-        <w:t>Weak spot.</w:t>
-      </w:r>
-      <w:r>
-        <w:rPr>
-          <w:rFonts w:ascii="Segoe UI" w:eastAsia="Times New Roman" w:hAnsi="Segoe UI" w:cs="Segoe UI"/>
-          <w:color w:val="839496"/>
-          <w:kern w:val="0"/>
-          <w:sz w:val="21"/>
-          <w:szCs w:val="21"/>
-          <w14:ligatures w14:val="none"/>
-        </w:rPr>
-        <w:t> Grinding-plant capex, quarry royalties, storage, and financing are </w:t>
-      </w:r>
-      <w:r>
-        <w:rPr>
-          <w:rFonts w:ascii="Segoe UI" w:eastAsia="Times New Roman" w:hAnsi="Segoe UI" w:cs="Segoe UI"/>
-          <w:i/>
-          <w:iCs/>
-          <w:color w:val="839496"/>
-          <w:kern w:val="0"/>
-          <w:sz w:val="21"/>
-          <w:szCs w:val="21"/>
-          <w14:ligatures w14:val="none"/>
-        </w:rPr>
-        <w:t>not</w:t>
-      </w:r>
-      <w:r>
-        <w:rPr>
-          <w:rFonts w:ascii="Segoe UI" w:eastAsia="Times New Roman" w:hAnsi="Segoe UI" w:cs="Segoe UI"/>
-          <w:color w:val="839496"/>
-          <w:kern w:val="0"/>
-          <w:sz w:val="21"/>
-          <w:szCs w:val="21"/>
-          <w14:ligatures w14:val="none"/>
-        </w:rPr>
-        <w:t> itemized - they are implicitly inside the $10 quarry gate and the energy-based grinding proxy. The $10/t is optimistic (assumes fines are a cheap by-product); worth a sensitivity row.</w:t>
+        <w:t>4. The MRV assumption, explicitly</w:t>
       </w:r>
     </w:p>
     <w:p>
       <w:pPr>
-        <w:spacing w:before="360" w:after="240" w:line="240" w:lineRule="auto"/>
-        <w:outlineLvl w:val="2"/>
-        <w:rPr>
-          <w:rFonts w:ascii="Segoe UI" w:eastAsia="Times New Roman" w:hAnsi="Segoe UI" w:cs="Segoe UI"/>
-          <w:b/>
-          <w:bCs/>
-          <w:color w:val="839496"/>
-          <w:kern w:val="0"/>
-          <w:sz w:val="30"/>
-          <w:szCs w:val="30"/>
-          <w14:ligatures w14:val="none"/>
-        </w:rPr>
-      </w:pPr>
-      <w:r>
-        <w:rPr>
-          <w:rFonts w:ascii="Segoe UI" w:eastAsia="Times New Roman" w:hAnsi="Segoe UI" w:cs="Segoe UI"/>
-          <w:b/>
-          <w:bCs/>
-          <w:color w:val="839496"/>
-          <w:kern w:val="0"/>
-          <w:sz w:val="30"/>
-          <w:szCs w:val="30"/>
-          <w14:ligatures w14:val="none"/>
-        </w:rPr>
-        <w:t>4. The MRV assumption, explicitly</w:t>
+        <w:spacing w:after="240" w:line="240" w:lineRule="auto"/>
+        <w:rPr>
+          <w:rFonts w:ascii="Segoe UI" w:eastAsia="Times New Roman" w:hAnsi="Segoe UI" w:cs="Segoe UI"/>
+          <w:color w:val="839496"/>
+          <w:kern w:val="0"/>
+          <w:sz w:val="21"/>
+          <w:szCs w:val="21"/>
+          <w14:ligatures w14:val="none"/>
+        </w:rPr>
+      </w:pPr>
+      <w:r>
+        <w:rPr>
+          <w:rFonts w:ascii="Segoe UI" w:eastAsia="Times New Roman" w:hAnsi="Segoe UI" w:cs="Segoe UI"/>
+          <w:b/>
+          <w:bCs/>
+          <w:color w:val="839496"/>
+          <w:kern w:val="0"/>
+          <w:sz w:val="21"/>
+          <w:szCs w:val="21"/>
+          <w14:ligatures w14:val="none"/>
+        </w:rPr>
+        <w:t>MRV = $20 per tCO₂</w:t>
+      </w:r>
+      <w:r>
+        <w:rPr>
+          <w:rFonts w:ascii="Segoe UI" w:eastAsia="Times New Roman" w:hAnsi="Segoe UI" w:cs="Segoe UI"/>
+          <w:color w:val="839496"/>
+          <w:kern w:val="0"/>
+          <w:sz w:val="21"/>
+          <w:szCs w:val="21"/>
+          <w14:ligatures w14:val="none"/>
+        </w:rPr>
+        <w:t>, subtracted directly from the carbon price so revenue = </w:t>
+      </w:r>
+      <w:r>
+        <w:rPr>
+          <w:rFonts w:ascii="Menlo" w:eastAsia="Times New Roman" w:hAnsi="Menlo" w:cs="Menlo"/>
+          <w:color w:val="D7BA7D"/>
+          <w:kern w:val="0"/>
+          <w:sz w:val="21"/>
+          <w:szCs w:val="21"/>
+          <w14:ligatures w14:val="none"/>
+        </w:rPr>
+        <w:t>net_CDR × (carbon_price − MRV) = net_CDR × ($150 − $20)</w:t>
+      </w:r>
+      <w:r>
+        <w:rPr>
+          <w:rFonts w:ascii="Segoe UI" w:eastAsia="Times New Roman" w:hAnsi="Segoe UI" w:cs="Segoe UI"/>
+          <w:color w:val="839496"/>
+          <w:kern w:val="0"/>
+          <w:sz w:val="21"/>
+          <w:szCs w:val="21"/>
+          <w14:ligatures w14:val="none"/>
+        </w:rPr>
+        <w:t>. </w:t>
+      </w:r>
+      <w:r>
+        <w:rPr>
+          <w:rFonts w:ascii="Menlo" w:eastAsia="Times New Roman" w:hAnsi="Menlo" w:cs="Menlo"/>
+          <w:color w:val="D7BA7D"/>
+          <w:kern w:val="0"/>
+          <w:sz w:val="21"/>
+          <w:szCs w:val="21"/>
+          <w14:ligatures w14:val="none"/>
+        </w:rPr>
+        <w:t>MRV_COST_USD_T_CO2</w:t>
+      </w:r>
+      <w:r>
+        <w:rPr>
+          <w:rFonts w:ascii="Segoe UI" w:eastAsia="Times New Roman" w:hAnsi="Segoe UI" w:cs="Segoe UI"/>
+          <w:color w:val="839496"/>
+          <w:kern w:val="0"/>
+          <w:sz w:val="21"/>
+          <w:szCs w:val="21"/>
+          <w14:ligatures w14:val="none"/>
+        </w:rPr>
+        <w:t> in </w:t>
+      </w:r>
+      <w:r>
+        <w:rPr>
+          <w:rFonts w:ascii="Menlo" w:eastAsia="Times New Roman" w:hAnsi="Menlo" w:cs="Menlo"/>
+          <w:color w:val="D7BA7D"/>
+          <w:kern w:val="0"/>
+          <w:sz w:val="21"/>
+          <w:szCs w:val="21"/>
+          <w14:ligatures w14:val="none"/>
+        </w:rPr>
+        <w:t>erw-7</w:t>
+      </w:r>
+      <w:r>
+        <w:rPr>
+          <w:rFonts w:ascii="Segoe UI" w:eastAsia="Times New Roman" w:hAnsi="Segoe UI" w:cs="Segoe UI"/>
+          <w:color w:val="839496"/>
+          <w:kern w:val="0"/>
+          <w:sz w:val="21"/>
+          <w:szCs w:val="21"/>
+          <w14:ligatures w14:val="none"/>
+        </w:rPr>
+        <w:t>.</w:t>
       </w:r>
     </w:p>
     <w:p>
@@ -3045,92 +3111,61 @@
       <w:r>
         <w:rPr>
           <w:rFonts w:ascii="Segoe UI" w:eastAsia="Times New Roman" w:hAnsi="Segoe UI" w:cs="Segoe UI"/>
-          <w:b/>
-          <w:bCs/>
-          <w:color w:val="839496"/>
-          <w:kern w:val="0"/>
-          <w:sz w:val="21"/>
-          <w:szCs w:val="21"/>
-          <w14:ligatures w14:val="none"/>
-        </w:rPr>
-        <w:t>MRV = $20 per tCO₂</w:t>
-      </w:r>
-      <w:r>
-        <w:rPr>
-          <w:rFonts w:ascii="Segoe UI" w:eastAsia="Times New Roman" w:hAnsi="Segoe UI" w:cs="Segoe UI"/>
-          <w:color w:val="839496"/>
-          <w:kern w:val="0"/>
-          <w:sz w:val="21"/>
-          <w:szCs w:val="21"/>
-          <w14:ligatures w14:val="none"/>
-        </w:rPr>
-        <w:t>, subtracted directly from the carbon price so revenue = </w:t>
-      </w:r>
-      <w:r>
-        <w:rPr>
-          <w:rFonts w:ascii="Menlo" w:eastAsia="Times New Roman" w:hAnsi="Menlo" w:cs="Menlo"/>
-          <w:color w:val="D7BA7D"/>
-          <w:kern w:val="0"/>
-          <w:sz w:val="21"/>
-          <w:szCs w:val="21"/>
-          <w14:ligatures w14:val="none"/>
-        </w:rPr>
-        <w:t>net_CDR × (carbon_price − MRV) = net_CDR × ($150 − $20)</w:t>
-      </w:r>
-      <w:r>
-        <w:rPr>
-          <w:rFonts w:ascii="Segoe UI" w:eastAsia="Times New Roman" w:hAnsi="Segoe UI" w:cs="Segoe UI"/>
-          <w:color w:val="839496"/>
-          <w:kern w:val="0"/>
-          <w:sz w:val="21"/>
-          <w:szCs w:val="21"/>
-          <w14:ligatures w14:val="none"/>
-        </w:rPr>
-        <w:t>. </w:t>
-      </w:r>
-      <w:r>
-        <w:rPr>
-          <w:rFonts w:ascii="Menlo" w:eastAsia="Times New Roman" w:hAnsi="Menlo" w:cs="Menlo"/>
-          <w:color w:val="D7BA7D"/>
-          <w:kern w:val="0"/>
-          <w:sz w:val="21"/>
-          <w:szCs w:val="21"/>
-          <w14:ligatures w14:val="none"/>
-        </w:rPr>
-        <w:t>MRV_COST_USD_T_CO2</w:t>
-      </w:r>
-      <w:r>
-        <w:rPr>
-          <w:rFonts w:ascii="Segoe UI" w:eastAsia="Times New Roman" w:hAnsi="Segoe UI" w:cs="Segoe UI"/>
-          <w:color w:val="839496"/>
-          <w:kern w:val="0"/>
-          <w:sz w:val="21"/>
-          <w:szCs w:val="21"/>
-          <w14:ligatures w14:val="none"/>
-        </w:rPr>
-        <w:t> in </w:t>
-      </w:r>
-      <w:r>
-        <w:rPr>
-          <w:rFonts w:ascii="Menlo" w:eastAsia="Times New Roman" w:hAnsi="Menlo" w:cs="Menlo"/>
-          <w:color w:val="D7BA7D"/>
-          <w:kern w:val="0"/>
-          <w:sz w:val="21"/>
-          <w:szCs w:val="21"/>
-          <w14:ligatures w14:val="none"/>
-        </w:rPr>
-        <w:t>erw-7</w:t>
-      </w:r>
-      <w:r>
-        <w:rPr>
-          <w:rFonts w:ascii="Segoe UI" w:eastAsia="Times New Roman" w:hAnsi="Segoe UI" w:cs="Segoe UI"/>
-          <w:color w:val="839496"/>
-          <w:kern w:val="0"/>
-          <w:sz w:val="21"/>
-          <w:szCs w:val="21"/>
-          <w14:ligatures w14:val="none"/>
-        </w:rPr>
-        <w:t>.</w:t>
+          <w:color w:val="839496"/>
+          <w:kern w:val="0"/>
+          <w:sz w:val="21"/>
+          <w:szCs w:val="21"/>
+          <w14:ligatures w14:val="none"/>
+        </w:rPr>
+        <w:t>The stack it represents: field sampling, lab analysis, verification, and registry fees. Code comment records the reasoning: </w:t>
+      </w:r>
+      <w:r>
+        <w:rPr>
+          <w:rFonts w:ascii="Segoe UI" w:eastAsia="Times New Roman" w:hAnsi="Segoe UI" w:cs="Segoe UI"/>
+          <w:b/>
+          <w:bCs/>
+          <w:color w:val="839496"/>
+          <w:kern w:val="0"/>
+          <w:sz w:val="21"/>
+          <w:szCs w:val="21"/>
+          <w14:ligatures w14:val="none"/>
+        </w:rPr>
+        <w:t>$30/tCO₂</w:t>
+      </w:r>
+      <w:r>
+        <w:rPr>
+          <w:rFonts w:ascii="Segoe UI" w:eastAsia="Times New Roman" w:hAnsi="Segoe UI" w:cs="Segoe UI"/>
+          <w:color w:val="839496"/>
+          <w:kern w:val="0"/>
+          <w:sz w:val="21"/>
+          <w:szCs w:val="21"/>
+          <w14:ligatures w14:val="none"/>
+        </w:rPr>
+        <w:t> is the first-of-kind pilot benchmark (Levy et al. 2024); </w:t>
+      </w:r>
+      <w:r>
+        <w:rPr>
+          <w:rFonts w:ascii="Segoe UI" w:eastAsia="Times New Roman" w:hAnsi="Segoe UI" w:cs="Segoe UI"/>
+          <w:b/>
+          <w:bCs/>
+          <w:color w:val="839496"/>
+          <w:kern w:val="0"/>
+          <w:sz w:val="21"/>
+          <w:szCs w:val="21"/>
+          <w14:ligatures w14:val="none"/>
+        </w:rPr>
+        <w:t>$20</w:t>
+      </w:r>
+      <w:r>
+        <w:rPr>
+          <w:rFonts w:ascii="Segoe UI" w:eastAsia="Times New Roman" w:hAnsi="Segoe UI" w:cs="Segoe UI"/>
+          <w:color w:val="839496"/>
+          <w:kern w:val="0"/>
+          <w:sz w:val="21"/>
+          <w:szCs w:val="21"/>
+          <w14:ligatures w14:val="none"/>
+        </w:rPr>
+        <w:t> is the at-scale aggregator/pooling target (Isometric/Puro-type protocols, 2027+). We use the optimistic-but-defensible $20 in the headline.</w:t>
       </w:r>
     </w:p>
     <w:p>
@@ -3148,126 +3183,54 @@
       <w:r>
         <w:rPr>
           <w:rFonts w:ascii="Segoe UI" w:eastAsia="Times New Roman" w:hAnsi="Segoe UI" w:cs="Segoe UI"/>
-          <w:color w:val="839496"/>
-          <w:kern w:val="0"/>
-          <w:sz w:val="21"/>
-          <w:szCs w:val="21"/>
-          <w14:ligatures w14:val="none"/>
-        </w:rPr>
-        <w:t>The stack it represents: field sampling, lab analysis, verification, and registry fees. Code comment records the reasoning: </w:t>
-      </w:r>
-      <w:r>
-        <w:rPr>
-          <w:rFonts w:ascii="Segoe UI" w:eastAsia="Times New Roman" w:hAnsi="Segoe UI" w:cs="Segoe UI"/>
-          <w:b/>
-          <w:bCs/>
-          <w:color w:val="839496"/>
-          <w:kern w:val="0"/>
-          <w:sz w:val="21"/>
-          <w:szCs w:val="21"/>
-          <w14:ligatures w14:val="none"/>
-        </w:rPr>
-        <w:t>$30/tCO₂</w:t>
-      </w:r>
-      <w:r>
-        <w:rPr>
-          <w:rFonts w:ascii="Segoe UI" w:eastAsia="Times New Roman" w:hAnsi="Segoe UI" w:cs="Segoe UI"/>
-          <w:color w:val="839496"/>
-          <w:kern w:val="0"/>
-          <w:sz w:val="21"/>
-          <w:szCs w:val="21"/>
-          <w14:ligatures w14:val="none"/>
-        </w:rPr>
-        <w:t> is the first-of-kind pilot benchmark (Levy et al. 2024); </w:t>
-      </w:r>
-      <w:r>
-        <w:rPr>
-          <w:rFonts w:ascii="Segoe UI" w:eastAsia="Times New Roman" w:hAnsi="Segoe UI" w:cs="Segoe UI"/>
-          <w:b/>
-          <w:bCs/>
-          <w:color w:val="839496"/>
-          <w:kern w:val="0"/>
-          <w:sz w:val="21"/>
-          <w:szCs w:val="21"/>
-          <w14:ligatures w14:val="none"/>
-        </w:rPr>
-        <w:t>$20</w:t>
-      </w:r>
-      <w:r>
-        <w:rPr>
-          <w:rFonts w:ascii="Segoe UI" w:eastAsia="Times New Roman" w:hAnsi="Segoe UI" w:cs="Segoe UI"/>
-          <w:color w:val="839496"/>
-          <w:kern w:val="0"/>
-          <w:sz w:val="21"/>
-          <w:szCs w:val="21"/>
-          <w14:ligatures w14:val="none"/>
-        </w:rPr>
-        <w:t> is the at-scale aggregator/pooling target (Isometric/Puro-type protocols, 2027+). We use the optimistic-but-defensible $20 in the headline.</w:t>
+          <w:b/>
+          <w:bCs/>
+          <w:color w:val="839496"/>
+          <w:kern w:val="0"/>
+          <w:sz w:val="21"/>
+          <w:szCs w:val="21"/>
+          <w14:ligatures w14:val="none"/>
+        </w:rPr>
+        <w:t>Weak spot / response.</w:t>
+      </w:r>
+      <w:r>
+        <w:rPr>
+          <w:rFonts w:ascii="Segoe UI" w:eastAsia="Times New Roman" w:hAnsi="Segoe UI" w:cs="Segoe UI"/>
+          <w:color w:val="839496"/>
+          <w:kern w:val="0"/>
+          <w:sz w:val="21"/>
+          <w:szCs w:val="21"/>
+          <w14:ligatures w14:val="none"/>
+        </w:rPr>
+        <w:t> Real early-market ERW MRV (dense soil/water sampling, uncertain reactive-transport models) can run </w:t>
+      </w:r>
+      <w:r>
+        <w:rPr>
+          <w:rFonts w:ascii="Segoe UI" w:eastAsia="Times New Roman" w:hAnsi="Segoe UI" w:cs="Segoe UI"/>
+          <w:b/>
+          <w:bCs/>
+          <w:color w:val="839496"/>
+          <w:kern w:val="0"/>
+          <w:sz w:val="21"/>
+          <w:szCs w:val="21"/>
+          <w14:ligatures w14:val="none"/>
+        </w:rPr>
+        <w:t>far above $20</w:t>
+      </w:r>
+      <w:r>
+        <w:rPr>
+          <w:rFonts w:ascii="Segoe UI" w:eastAsia="Times New Roman" w:hAnsi="Segoe UI" w:cs="Segoe UI"/>
+          <w:color w:val="839496"/>
+          <w:kern w:val="0"/>
+          <w:sz w:val="21"/>
+          <w:szCs w:val="21"/>
+          <w14:ligatures w14:val="none"/>
+        </w:rPr>
+        <w:t> - some estimates put first-mover MRV at $50-100+/tCO₂. Since MRV enters one-for-one with price, it's a first-order lever. Response: hold it explicit, sweep $20/$30/$50, and note the headline uses the mature-market value.</w:t>
       </w:r>
     </w:p>
     <w:p>
       <w:pPr>
-        <w:spacing w:after="240" w:line="240" w:lineRule="auto"/>
-        <w:rPr>
-          <w:rFonts w:ascii="Segoe UI" w:eastAsia="Times New Roman" w:hAnsi="Segoe UI" w:cs="Segoe UI"/>
-          <w:color w:val="839496"/>
-          <w:kern w:val="0"/>
-          <w:sz w:val="21"/>
-          <w:szCs w:val="21"/>
-          <w14:ligatures w14:val="none"/>
-        </w:rPr>
-      </w:pPr>
-      <w:r>
-        <w:rPr>
-          <w:rFonts w:ascii="Segoe UI" w:eastAsia="Times New Roman" w:hAnsi="Segoe UI" w:cs="Segoe UI"/>
-          <w:b/>
-          <w:bCs/>
-          <w:color w:val="839496"/>
-          <w:kern w:val="0"/>
-          <w:sz w:val="21"/>
-          <w:szCs w:val="21"/>
-          <w14:ligatures w14:val="none"/>
-        </w:rPr>
-        <w:t>Weak spot / response.</w:t>
-      </w:r>
-      <w:r>
-        <w:rPr>
-          <w:rFonts w:ascii="Segoe UI" w:eastAsia="Times New Roman" w:hAnsi="Segoe UI" w:cs="Segoe UI"/>
-          <w:color w:val="839496"/>
-          <w:kern w:val="0"/>
-          <w:sz w:val="21"/>
-          <w:szCs w:val="21"/>
-          <w14:ligatures w14:val="none"/>
-        </w:rPr>
-        <w:t> Real early-market ERW MRV (dense soil/water sampling, uncertain reactive-transport models) can run </w:t>
-      </w:r>
-      <w:r>
-        <w:rPr>
-          <w:rFonts w:ascii="Segoe UI" w:eastAsia="Times New Roman" w:hAnsi="Segoe UI" w:cs="Segoe UI"/>
-          <w:b/>
-          <w:bCs/>
-          <w:color w:val="839496"/>
-          <w:kern w:val="0"/>
-          <w:sz w:val="21"/>
-          <w:szCs w:val="21"/>
-          <w14:ligatures w14:val="none"/>
-        </w:rPr>
-        <w:t>far above $20</w:t>
-      </w:r>
-      <w:r>
-        <w:rPr>
-          <w:rFonts w:ascii="Segoe UI" w:eastAsia="Times New Roman" w:hAnsi="Segoe UI" w:cs="Segoe UI"/>
-          <w:color w:val="839496"/>
-          <w:kern w:val="0"/>
-          <w:sz w:val="21"/>
-          <w:szCs w:val="21"/>
-          <w14:ligatures w14:val="none"/>
-        </w:rPr>
-        <w:t> - some estimates put first-mover MRV at $50-100+/tCO₂. Since MRV enters one-for-one with price, it's a first-order lever. Response: hold it explicit, sweep $20/$30/$50, and note the headline uses the mature-market value.</w:t>
-      </w:r>
-    </w:p>
-    <w:p>
-      <w:pPr>
         <w:spacing w:after="0" w:line="240" w:lineRule="auto"/>
         <w:rPr>
           <w:rFonts w:ascii="Segoe UI" w:eastAsia="Times New Roman" w:hAnsi="Segoe UI" w:cs="Segoe UI"/>
@@ -3283,7 +3246,7 @@
           <w:noProof/>
           <w:kern w:val="0"/>
         </w:rPr>
-        <w:pict w14:anchorId="6F3AF7E6">
+        <w:pict w14:anchorId="6A9A47E2">
           <v:rect id="_x0000_i1028" style="width:0;height:.75pt" o:hralign="center" o:hrstd="t" o:hr="t" fillcolor="#a0a0a0" stroked="f"/>
         </w:pict>
       </w:r>
@@ -3674,7 +3637,6 @@
           <w:szCs w:val="30"/>
           <w14:ligatures w14:val="none"/>
         </w:rPr>
-        <w:lastRenderedPageBreak/>
         <w:t>6. Slide 8 - units of "Durable CDR (Mt)" and "% treated"</w:t>
       </w:r>
     </w:p>
@@ -3705,6 +3667,7 @@
           <w:szCs w:val="21"/>
           <w14:ligatures w14:val="none"/>
         </w:rPr>
+        <w:lastRenderedPageBreak/>
         <w:t>Durable CDR (Mt)</w:t>
       </w:r>
       <w:r>
@@ -3858,7 +3821,33 @@
           <w:szCs w:val="30"/>
           <w14:ligatures w14:val="none"/>
         </w:rPr>
-        <w:t>7. Slide 9 - reference for </w:t>
+        <w:t xml:space="preserve">7. Slide </w:t>
+      </w:r>
+      <w:r>
+        <w:rPr>
+          <w:rFonts w:ascii="Segoe UI" w:eastAsia="Times New Roman" w:hAnsi="Segoe UI" w:cs="Segoe UI"/>
+          <w:b/>
+          <w:bCs/>
+          <w:color w:val="839496"/>
+          <w:kern w:val="0"/>
+          <w:sz w:val="30"/>
+          <w:szCs w:val="30"/>
+          <w14:ligatures w14:val="none"/>
+        </w:rPr>
+        <w:t>10</w:t>
+      </w:r>
+      <w:r>
+        <w:rPr>
+          <w:rFonts w:ascii="Segoe UI" w:eastAsia="Times New Roman" w:hAnsi="Segoe UI" w:cs="Segoe UI"/>
+          <w:b/>
+          <w:bCs/>
+          <w:color w:val="839496"/>
+          <w:kern w:val="0"/>
+          <w:sz w:val="30"/>
+          <w:szCs w:val="30"/>
+          <w14:ligatures w14:val="none"/>
+        </w:rPr>
+        <w:t xml:space="preserve"> - reference for </w:t>
       </w:r>
       <w:r>
         <w:rPr>
@@ -4713,8 +4702,7 @@
           <w:noProof/>
           <w:kern w:val="0"/>
         </w:rPr>
-        <w:lastRenderedPageBreak/>
-        <w:pict w14:anchorId="426EDB25">
+        <w:pict w14:anchorId="536B3D79">
           <v:rect id="_x0000_i1027" style="width:0;height:.75pt" o:hralign="center" o:hrstd="t" o:hr="t" fillcolor="#a0a0a0" stroked="f"/>
         </w:pict>
       </w:r>
@@ -4745,6 +4733,7 @@
           <w:szCs w:val="36"/>
           <w14:ligatures w14:val="none"/>
         </w:rPr>
+        <w:lastRenderedPageBreak/>
         <w:t>C. Agronomic response (slide 10) and kinetics (slides 10-11)</w:t>
       </w:r>
     </w:p>
@@ -5529,6 +5518,7 @@
           <w14:ligatures w14:val="none"/>
         </w:rPr>
       </w:pPr>
+      <w:bookmarkStart w:id="0" w:name="OLE_LINK1"/>
       <w:r>
         <w:rPr>
           <w:rFonts w:ascii="Menlo" w:eastAsia="Times New Roman" w:hAnsi="Menlo" w:cs="Menlo"/>
@@ -5598,6 +5588,7 @@
         <w:t> is the (uncertain) proportionality between ECEC and buffering.</w:t>
       </w:r>
     </w:p>
+    <w:bookmarkEnd w:id="0"/>
     <w:p>
       <w:pPr>
         <w:numPr>
@@ -6627,7 +6618,7 @@
           <w:noProof/>
           <w:kern w:val="0"/>
         </w:rPr>
-        <w:pict w14:anchorId="3A4E17F2">
+        <w:pict w14:anchorId="1DD90BCF">
           <v:rect id="_x0000_i1026" alt="" style="width:468pt;height:.05pt;mso-width-percent:0;mso-height-percent:0;mso-width-percent:0;mso-height-percent:0" o:hralign="center" o:hrstd="t" o:hr="t" fillcolor="#a0a0a0" stroked="f"/>
         </w:pict>
       </w:r>
@@ -7215,7 +7206,7 @@
           <w:noProof/>
           <w:kern w:val="0"/>
         </w:rPr>
-        <w:pict w14:anchorId="48FED932">
+        <w:pict w14:anchorId="78D70E67">
           <v:rect id="_x0000_i1025" style="width:0;height:.75pt" o:hralign="center" o:hrstd="t" o:hr="t" fillcolor="#a0a0a0" stroked="f"/>
         </w:pict>
       </w:r>

</xml_diff>